<commit_message>
Say where the three scripts actually are
The write-up claimed the scripts were published with the entry without
naming a place a judge could open. Reproducibility is 20% of this prize and
an entry whose findings cannot be reproduced is not scored, so the claim had
to carry a URL.

Co-Authored-By: Claude Opus 5 <noreply@anthropic.com>
Claude-Session: https://claude.ai/code/session_01GMgjfJ58DWP2XDSQsajVtH
</commit_message>
<xml_diff>
--- a/MEMOIRE.docx
+++ b/MEMOIRE.docx
@@ -3445,6 +3445,25 @@
       </w:pPr>
       <w:r>
         <w:rPr/>
+        <w:t xml:space="preserve">Everything below is at </w:t>
+      </w:r>
+      <w:r>
+        <w:rPr>
+          <w:b/>
+        </w:rPr>
+        <w:t>https://github.com/Yoh5/bias-bounty-uhe</w:t>
+      </w:r>
+      <w:r>
+        <w:rPr/>
+        <w:t xml:space="preserve"> — the three scripts, the result tables they produce, and this write-up.</w:t>
+      </w:r>
+    </w:p>
+    <w:p>
+      <w:pPr>
+        <w:jc w:val="both"/>
+      </w:pPr>
+      <w:r>
+        <w:rPr/>
         <w:t>Three scripts, provided data only, no randomness:</w:t>
       </w:r>
     </w:p>

</xml_diff>

<commit_message>
Name the three uses the prize is judged on, and the one we do not claim
Impact is 30% of Best Bias Discovery and the challenge states the test in
its own words: emergency dispatch, evacuation routing, disaster relief. The
write-up argued cooling centres, heat alerts and doorknocking -- the same
thing in different vocabulary, which a judge should not have to translate.
Evacuation routing is named only to say heat rarely triggers it and that we
make no claim there.

Co-Authored-By: Claude Opus 5 <noreply@anthropic.com>
Claude-Session: https://claude.ai/code/session_01GMgjfJ58DWP2XDSQsajVtH
</commit_message>
<xml_diff>
--- a/MEMOIRE.docx
+++ b/MEMOIRE.docx
@@ -2573,7 +2573,27 @@
       </w:r>
       <w:r>
         <w:rPr/>
-        <w:t>. Those decisions are made at tract level, from exactly the kind of layer that is missing here.</w:t>
+        <w:t xml:space="preserve">. Those decisions are made at tract level, from exactly the kind of layer that is missing here. In the terms this challenge uses: the absence bears on </w:t>
+      </w:r>
+      <w:r>
+        <w:rPr>
+          <w:b/>
+        </w:rPr>
+        <w:t>emergency dispatch</w:t>
+      </w:r>
+      <w:r>
+        <w:rPr/>
+        <w:t xml:space="preserve"> — which tracts a heat-illness surge is anticipated in, and where crews are staged before it — and on </w:t>
+      </w:r>
+      <w:r>
+        <w:rPr>
+          <w:b/>
+        </w:rPr>
+        <w:t>disaster relief</w:t>
+      </w:r>
+      <w:r>
+        <w:rPr/>
+        <w:t xml:space="preserve"> — where a cooling centre, a water distribution point or a wellness check is placed once an event is under way. It bears less on evacuation routing, which heat rarely triggers, and we do not claim it does.</w:t>
       </w:r>
     </w:p>
     <w:p>

</xml_diff>